<commit_message>
Strip structural tags from output DOCX content nodes
- stripTagMarkupFromNode now works at <w:p> level: concatenates all <w:t>
  runs per paragraph before checking against NODE_TAG_STRIP_RE, so tags
  split across multiple runs are correctly detected and cleared
- Paragraph-level filter in extractContentNodes/extractContentParaNodes
  skips tag-only paragraphs unless they contain images (cover-table guard)
- Applies to both build-all.js (Node pipeline) and upload-media.js (browser)
- All 15 output .docx files rebuilt and verified clean (verify-tags.js: 15/15 OK)
- Delete old test5-* artefacts from outputs/docx/

Co-Authored-By: Claude Sonnet 4.6 <noreply@anthropic.com>
</commit_message>
<xml_diff>
--- a/document-splitter/outputs/docx/CP4807-0.docx
+++ b/document-splitter/outputs/docx/CP4807-0.docx
@@ -46,13 +46,13 @@
               <w:pStyle w:val="Wsreference"/>
             </w:pPr>
             <w:r>
-              <w:t> &lt;filename&gt; “</w:t>
+              <w:t/>
             </w:r>
             <w:r>
-              <w:t>CP4807-0</w:t>
+              <w:t/>
             </w:r>
             <w:r>
-              <w:t>.doc” &lt;/filename&gt;</w:t>
+              <w:t/>
             </w:r>
           </w:p>
           <w:p>

</xml_diff>